<commit_message>
Modificated Report to new version
</commit_message>
<xml_diff>
--- a/Отчет Пр5 Каблуков Егор Пр23-102.docx
+++ b/Отчет Пр5 Каблуков Егор Пр23-102.docx
@@ -403,9 +403,629 @@
           <w:szCs w:val="28"/>
         </w:rPr>
       </w:pPr>
+      <w:r>
+        <w:rPr>
+          <w:rFonts w:ascii="Times New Roman" w:hAnsi="Times New Roman" w:cs="Times New Roman"/>
+          <w:sz w:val="28"/>
+          <w:szCs w:val="28"/>
+        </w:rPr>
+        <w:lastRenderedPageBreak/>
+        <w:t>Создаем новый сетевой репозиторий. Добавляем туда 3 файла с разными расширениями</w:t>
+      </w:r>
+    </w:p>
+    <w:p>
+      <w:pPr>
+        <w:ind w:firstLine="709"/>
+        <w:rPr>
+          <w:rFonts w:ascii="Times New Roman" w:hAnsi="Times New Roman" w:cs="Times New Roman"/>
+          <w:sz w:val="28"/>
+          <w:szCs w:val="28"/>
+        </w:rPr>
+      </w:pPr>
+      <w:r>
+        <w:rPr>
+          <w:rFonts w:ascii="Times New Roman" w:hAnsi="Times New Roman" w:cs="Times New Roman"/>
+          <w:sz w:val="28"/>
+          <w:szCs w:val="28"/>
+        </w:rPr>
+        <w:drawing>
+          <wp:inline distT="0" distB="0" distL="0" distR="0" wp14:anchorId="4AA64FB9" wp14:editId="61DF7950">
+            <wp:extent cx="4859079" cy="2720669"/>
+            <wp:effectExtent l="0" t="0" r="0" b="3810"/>
+            <wp:docPr id="1" name="Рисунок 1"/>
+            <wp:cNvGraphicFramePr>
+              <a:graphicFrameLocks xmlns:a="http://schemas.openxmlformats.org/drawingml/2006/main" noChangeAspect="1"/>
+            </wp:cNvGraphicFramePr>
+            <a:graphic xmlns:a="http://schemas.openxmlformats.org/drawingml/2006/main">
+              <a:graphicData uri="http://schemas.openxmlformats.org/drawingml/2006/picture">
+                <pic:pic xmlns:pic="http://schemas.openxmlformats.org/drawingml/2006/picture">
+                  <pic:nvPicPr>
+                    <pic:cNvPr id="1" name=""/>
+                    <pic:cNvPicPr/>
+                  </pic:nvPicPr>
+                  <pic:blipFill>
+                    <a:blip r:embed="rId7"/>
+                    <a:stretch>
+                      <a:fillRect/>
+                    </a:stretch>
+                  </pic:blipFill>
+                  <pic:spPr>
+                    <a:xfrm>
+                      <a:off x="0" y="0"/>
+                      <a:ext cx="4883027" cy="2734078"/>
+                    </a:xfrm>
+                    <a:prstGeom prst="rect">
+                      <a:avLst/>
+                    </a:prstGeom>
+                  </pic:spPr>
+                </pic:pic>
+              </a:graphicData>
+            </a:graphic>
+          </wp:inline>
+        </w:drawing>
+      </w:r>
+    </w:p>
+    <w:p>
+      <w:pPr>
+        <w:ind w:firstLine="709"/>
+        <w:rPr>
+          <w:rFonts w:ascii="Times New Roman" w:hAnsi="Times New Roman" w:cs="Times New Roman"/>
+          <w:sz w:val="28"/>
+          <w:szCs w:val="28"/>
+        </w:rPr>
+      </w:pPr>
+      <w:r>
+        <w:rPr>
+          <w:rFonts w:ascii="Times New Roman" w:hAnsi="Times New Roman" w:cs="Times New Roman"/>
+          <w:sz w:val="28"/>
+          <w:szCs w:val="28"/>
+        </w:rPr>
+        <w:t>Создаем 4 дополнительные ветки в сетевом репозитории</w:t>
+      </w:r>
+      <w:r>
+        <w:rPr>
+          <w:rFonts w:ascii="Times New Roman" w:hAnsi="Times New Roman" w:cs="Times New Roman"/>
+          <w:sz w:val="28"/>
+          <w:szCs w:val="28"/>
+          <w:lang w:val="en-US"/>
+        </w:rPr>
+        <w:drawing>
+          <wp:inline distT="0" distB="0" distL="0" distR="0" wp14:anchorId="32930924" wp14:editId="31A619A0">
+            <wp:extent cx="4529470" cy="4890181"/>
+            <wp:effectExtent l="0" t="0" r="4445" b="5715"/>
+            <wp:docPr id="4" name="Рисунок 4"/>
+            <wp:cNvGraphicFramePr>
+              <a:graphicFrameLocks xmlns:a="http://schemas.openxmlformats.org/drawingml/2006/main" noChangeAspect="1"/>
+            </wp:cNvGraphicFramePr>
+            <a:graphic xmlns:a="http://schemas.openxmlformats.org/drawingml/2006/main">
+              <a:graphicData uri="http://schemas.openxmlformats.org/drawingml/2006/picture">
+                <pic:pic xmlns:pic="http://schemas.openxmlformats.org/drawingml/2006/picture">
+                  <pic:nvPicPr>
+                    <pic:cNvPr id="1" name=""/>
+                    <pic:cNvPicPr/>
+                  </pic:nvPicPr>
+                  <pic:blipFill>
+                    <a:blip r:embed="rId8"/>
+                    <a:stretch>
+                      <a:fillRect/>
+                    </a:stretch>
+                  </pic:blipFill>
+                  <pic:spPr>
+                    <a:xfrm>
+                      <a:off x="0" y="0"/>
+                      <a:ext cx="4529470" cy="4890181"/>
+                    </a:xfrm>
+                    <a:prstGeom prst="rect">
+                      <a:avLst/>
+                    </a:prstGeom>
+                  </pic:spPr>
+                </pic:pic>
+              </a:graphicData>
+            </a:graphic>
+          </wp:inline>
+        </w:drawing>
+      </w:r>
+      <w:r>
+        <w:rPr>
+          <w:rFonts w:ascii="Times New Roman" w:hAnsi="Times New Roman" w:cs="Times New Roman"/>
+          <w:sz w:val="28"/>
+          <w:szCs w:val="28"/>
+          <w:lang w:val="en-US"/>
+        </w:rPr>
+        <w:lastRenderedPageBreak/>
+        <w:drawing>
+          <wp:inline distT="0" distB="0" distL="0" distR="0" wp14:anchorId="002C8AC1" wp14:editId="77FCE898">
+            <wp:extent cx="4104698" cy="3976577"/>
+            <wp:effectExtent l="0" t="0" r="0" b="5080"/>
+            <wp:docPr id="2" name="Рисунок 2"/>
+            <wp:cNvGraphicFramePr>
+              <a:graphicFrameLocks xmlns:a="http://schemas.openxmlformats.org/drawingml/2006/main" noChangeAspect="1"/>
+            </wp:cNvGraphicFramePr>
+            <a:graphic xmlns:a="http://schemas.openxmlformats.org/drawingml/2006/main">
+              <a:graphicData uri="http://schemas.openxmlformats.org/drawingml/2006/picture">
+                <pic:pic xmlns:pic="http://schemas.openxmlformats.org/drawingml/2006/picture">
+                  <pic:nvPicPr>
+                    <pic:cNvPr id="1" name=""/>
+                    <pic:cNvPicPr/>
+                  </pic:nvPicPr>
+                  <pic:blipFill>
+                    <a:blip r:embed="rId9"/>
+                    <a:stretch>
+                      <a:fillRect/>
+                    </a:stretch>
+                  </pic:blipFill>
+                  <pic:spPr>
+                    <a:xfrm>
+                      <a:off x="0" y="0"/>
+                      <a:ext cx="4114960" cy="3986519"/>
+                    </a:xfrm>
+                    <a:prstGeom prst="rect">
+                      <a:avLst/>
+                    </a:prstGeom>
+                  </pic:spPr>
+                </pic:pic>
+              </a:graphicData>
+            </a:graphic>
+          </wp:inline>
+        </w:drawing>
+      </w:r>
+      <w:r>
+        <w:rPr>
+          <w:rFonts w:ascii="Times New Roman" w:hAnsi="Times New Roman" w:cs="Times New Roman"/>
+          <w:sz w:val="28"/>
+          <w:szCs w:val="28"/>
+          <w:lang w:val="en-US"/>
+        </w:rPr>
+        <w:drawing>
+          <wp:inline distT="0" distB="0" distL="0" distR="0" wp14:anchorId="68D2E59D" wp14:editId="3F2029D7">
+            <wp:extent cx="4425864" cy="4731488"/>
+            <wp:effectExtent l="0" t="0" r="0" b="0"/>
+            <wp:docPr id="3" name="Рисунок 3"/>
+            <wp:cNvGraphicFramePr>
+              <a:graphicFrameLocks xmlns:a="http://schemas.openxmlformats.org/drawingml/2006/main" noChangeAspect="1"/>
+            </wp:cNvGraphicFramePr>
+            <a:graphic xmlns:a="http://schemas.openxmlformats.org/drawingml/2006/main">
+              <a:graphicData uri="http://schemas.openxmlformats.org/drawingml/2006/picture">
+                <pic:pic xmlns:pic="http://schemas.openxmlformats.org/drawingml/2006/picture">
+                  <pic:nvPicPr>
+                    <pic:cNvPr id="1" name=""/>
+                    <pic:cNvPicPr/>
+                  </pic:nvPicPr>
+                  <pic:blipFill>
+                    <a:blip r:embed="rId10"/>
+                    <a:stretch>
+                      <a:fillRect/>
+                    </a:stretch>
+                  </pic:blipFill>
+                  <pic:spPr>
+                    <a:xfrm>
+                      <a:off x="0" y="0"/>
+                      <a:ext cx="4428980" cy="4734820"/>
+                    </a:xfrm>
+                    <a:prstGeom prst="rect">
+                      <a:avLst/>
+                    </a:prstGeom>
+                  </pic:spPr>
+                </pic:pic>
+              </a:graphicData>
+            </a:graphic>
+          </wp:inline>
+        </w:drawing>
+      </w:r>
+    </w:p>
+    <w:p>
+      <w:pPr>
+        <w:ind w:firstLine="709"/>
+        <w:rPr>
+          <w:rFonts w:ascii="Times New Roman" w:hAnsi="Times New Roman" w:cs="Times New Roman"/>
+          <w:sz w:val="28"/>
+          <w:szCs w:val="28"/>
+          <w:lang w:val="en-US"/>
+        </w:rPr>
+      </w:pPr>
+      <w:r>
+        <w:rPr>
+          <w:rFonts w:ascii="Times New Roman" w:hAnsi="Times New Roman" w:cs="Times New Roman"/>
+          <w:sz w:val="28"/>
+          <w:szCs w:val="28"/>
+          <w:lang w:val="en-US"/>
+        </w:rPr>
+        <w:lastRenderedPageBreak/>
+        <w:drawing>
+          <wp:inline distT="0" distB="0" distL="0" distR="0" wp14:anchorId="3E56238F" wp14:editId="6A2810F8">
+            <wp:extent cx="4838844" cy="4646428"/>
+            <wp:effectExtent l="0" t="0" r="0" b="1905"/>
+            <wp:docPr id="5" name="Рисунок 5"/>
+            <wp:cNvGraphicFramePr>
+              <a:graphicFrameLocks xmlns:a="http://schemas.openxmlformats.org/drawingml/2006/main" noChangeAspect="1"/>
+            </wp:cNvGraphicFramePr>
+            <a:graphic xmlns:a="http://schemas.openxmlformats.org/drawingml/2006/main">
+              <a:graphicData uri="http://schemas.openxmlformats.org/drawingml/2006/picture">
+                <pic:pic xmlns:pic="http://schemas.openxmlformats.org/drawingml/2006/picture">
+                  <pic:nvPicPr>
+                    <pic:cNvPr id="1" name=""/>
+                    <pic:cNvPicPr/>
+                  </pic:nvPicPr>
+                  <pic:blipFill>
+                    <a:blip r:embed="rId11"/>
+                    <a:stretch>
+                      <a:fillRect/>
+                    </a:stretch>
+                  </pic:blipFill>
+                  <pic:spPr>
+                    <a:xfrm>
+                      <a:off x="0" y="0"/>
+                      <a:ext cx="4844095" cy="4651470"/>
+                    </a:xfrm>
+                    <a:prstGeom prst="rect">
+                      <a:avLst/>
+                    </a:prstGeom>
+                  </pic:spPr>
+                </pic:pic>
+              </a:graphicData>
+            </a:graphic>
+          </wp:inline>
+        </w:drawing>
+      </w:r>
+    </w:p>
+    <w:p>
+      <w:pPr>
+        <w:ind w:firstLine="709"/>
+        <w:rPr>
+          <w:rFonts w:ascii="Times New Roman" w:hAnsi="Times New Roman" w:cs="Times New Roman"/>
+          <w:sz w:val="28"/>
+          <w:szCs w:val="28"/>
+        </w:rPr>
+      </w:pPr>
+      <w:r>
+        <w:rPr>
+          <w:rFonts w:ascii="Times New Roman" w:hAnsi="Times New Roman" w:cs="Times New Roman"/>
+          <w:sz w:val="28"/>
+          <w:szCs w:val="28"/>
+        </w:rPr>
+        <w:t>Теперь клонируем сетевой репозиторий и получаем локальную версию.</w:t>
+      </w:r>
+    </w:p>
+    <w:p>
+      <w:pPr>
+        <w:ind w:firstLine="709"/>
+        <w:rPr>
+          <w:rFonts w:ascii="Times New Roman" w:hAnsi="Times New Roman" w:cs="Times New Roman"/>
+          <w:sz w:val="28"/>
+          <w:szCs w:val="28"/>
+          <w:lang w:val="en-US"/>
+        </w:rPr>
+      </w:pPr>
+      <w:r>
+        <w:rPr>
+          <w:rFonts w:ascii="Times New Roman" w:hAnsi="Times New Roman" w:cs="Times New Roman"/>
+          <w:sz w:val="28"/>
+          <w:szCs w:val="28"/>
+          <w:lang w:val="en-US"/>
+        </w:rPr>
+        <w:drawing>
+          <wp:inline distT="0" distB="0" distL="0" distR="0" wp14:anchorId="27AA1B87" wp14:editId="24530709">
+            <wp:extent cx="5940425" cy="1288415"/>
+            <wp:effectExtent l="0" t="0" r="3175" b="6985"/>
+            <wp:docPr id="6" name="Рисунок 6"/>
+            <wp:cNvGraphicFramePr>
+              <a:graphicFrameLocks xmlns:a="http://schemas.openxmlformats.org/drawingml/2006/main" noChangeAspect="1"/>
+            </wp:cNvGraphicFramePr>
+            <a:graphic xmlns:a="http://schemas.openxmlformats.org/drawingml/2006/main">
+              <a:graphicData uri="http://schemas.openxmlformats.org/drawingml/2006/picture">
+                <pic:pic xmlns:pic="http://schemas.openxmlformats.org/drawingml/2006/picture">
+                  <pic:nvPicPr>
+                    <pic:cNvPr id="1" name=""/>
+                    <pic:cNvPicPr/>
+                  </pic:nvPicPr>
+                  <pic:blipFill>
+                    <a:blip r:embed="rId12"/>
+                    <a:stretch>
+                      <a:fillRect/>
+                    </a:stretch>
+                  </pic:blipFill>
+                  <pic:spPr>
+                    <a:xfrm>
+                      <a:off x="0" y="0"/>
+                      <a:ext cx="5940425" cy="1288415"/>
+                    </a:xfrm>
+                    <a:prstGeom prst="rect">
+                      <a:avLst/>
+                    </a:prstGeom>
+                  </pic:spPr>
+                </pic:pic>
+              </a:graphicData>
+            </a:graphic>
+          </wp:inline>
+        </w:drawing>
+      </w:r>
+    </w:p>
+    <w:p>
+      <w:pPr>
+        <w:ind w:firstLine="709"/>
+        <w:rPr>
+          <w:rFonts w:ascii="Times New Roman" w:hAnsi="Times New Roman" w:cs="Times New Roman"/>
+          <w:sz w:val="28"/>
+          <w:szCs w:val="28"/>
+          <w:lang w:val="en-US"/>
+        </w:rPr>
+      </w:pPr>
+      <w:r>
+        <w:rPr>
+          <w:rFonts w:ascii="Times New Roman" w:hAnsi="Times New Roman" w:cs="Times New Roman"/>
+          <w:sz w:val="28"/>
+          <w:szCs w:val="28"/>
+          <w:lang w:val="en-US"/>
+        </w:rPr>
+        <w:drawing>
+          <wp:inline distT="0" distB="0" distL="0" distR="0" wp14:anchorId="49895900" wp14:editId="31A1A115">
+            <wp:extent cx="5940425" cy="1381125"/>
+            <wp:effectExtent l="0" t="0" r="3175" b="9525"/>
+            <wp:docPr id="7" name="Рисунок 7"/>
+            <wp:cNvGraphicFramePr>
+              <a:graphicFrameLocks xmlns:a="http://schemas.openxmlformats.org/drawingml/2006/main" noChangeAspect="1"/>
+            </wp:cNvGraphicFramePr>
+            <a:graphic xmlns:a="http://schemas.openxmlformats.org/drawingml/2006/main">
+              <a:graphicData uri="http://schemas.openxmlformats.org/drawingml/2006/picture">
+                <pic:pic xmlns:pic="http://schemas.openxmlformats.org/drawingml/2006/picture">
+                  <pic:nvPicPr>
+                    <pic:cNvPr id="1" name=""/>
+                    <pic:cNvPicPr/>
+                  </pic:nvPicPr>
+                  <pic:blipFill>
+                    <a:blip r:embed="rId13"/>
+                    <a:stretch>
+                      <a:fillRect/>
+                    </a:stretch>
+                  </pic:blipFill>
+                  <pic:spPr>
+                    <a:xfrm>
+                      <a:off x="0" y="0"/>
+                      <a:ext cx="5940425" cy="1381125"/>
+                    </a:xfrm>
+                    <a:prstGeom prst="rect">
+                      <a:avLst/>
+                    </a:prstGeom>
+                  </pic:spPr>
+                </pic:pic>
+              </a:graphicData>
+            </a:graphic>
+          </wp:inline>
+        </w:drawing>
+      </w:r>
+    </w:p>
+    <w:p>
+      <w:pPr>
+        <w:ind w:firstLine="709"/>
+        <w:rPr>
+          <w:rFonts w:ascii="Times New Roman" w:hAnsi="Times New Roman" w:cs="Times New Roman"/>
+          <w:sz w:val="28"/>
+          <w:szCs w:val="28"/>
+          <w:lang w:val="en-US"/>
+        </w:rPr>
+      </w:pPr>
+      <w:r>
+        <w:rPr>
+          <w:rFonts w:ascii="Times New Roman" w:hAnsi="Times New Roman" w:cs="Times New Roman"/>
+          <w:sz w:val="28"/>
+          <w:szCs w:val="28"/>
+          <w:lang w:val="en-US"/>
+        </w:rPr>
+        <w:lastRenderedPageBreak/>
+        <w:drawing>
+          <wp:inline distT="0" distB="0" distL="0" distR="0" wp14:anchorId="3546A1E3" wp14:editId="6CDCE474">
+            <wp:extent cx="5940425" cy="1517650"/>
+            <wp:effectExtent l="0" t="0" r="3175" b="6350"/>
+            <wp:docPr id="8" name="Рисунок 8"/>
+            <wp:cNvGraphicFramePr>
+              <a:graphicFrameLocks xmlns:a="http://schemas.openxmlformats.org/drawingml/2006/main" noChangeAspect="1"/>
+            </wp:cNvGraphicFramePr>
+            <a:graphic xmlns:a="http://schemas.openxmlformats.org/drawingml/2006/main">
+              <a:graphicData uri="http://schemas.openxmlformats.org/drawingml/2006/picture">
+                <pic:pic xmlns:pic="http://schemas.openxmlformats.org/drawingml/2006/picture">
+                  <pic:nvPicPr>
+                    <pic:cNvPr id="1" name=""/>
+                    <pic:cNvPicPr/>
+                  </pic:nvPicPr>
+                  <pic:blipFill>
+                    <a:blip r:embed="rId14"/>
+                    <a:stretch>
+                      <a:fillRect/>
+                    </a:stretch>
+                  </pic:blipFill>
+                  <pic:spPr>
+                    <a:xfrm>
+                      <a:off x="0" y="0"/>
+                      <a:ext cx="5940425" cy="1517650"/>
+                    </a:xfrm>
+                    <a:prstGeom prst="rect">
+                      <a:avLst/>
+                    </a:prstGeom>
+                  </pic:spPr>
+                </pic:pic>
+              </a:graphicData>
+            </a:graphic>
+          </wp:inline>
+        </w:drawing>
+      </w:r>
+    </w:p>
+    <w:p>
+      <w:pPr>
+        <w:ind w:firstLine="709"/>
+        <w:rPr>
+          <w:rFonts w:ascii="Times New Roman" w:hAnsi="Times New Roman" w:cs="Times New Roman"/>
+          <w:sz w:val="28"/>
+          <w:szCs w:val="28"/>
+          <w:lang w:val="en-US"/>
+        </w:rPr>
+      </w:pPr>
+      <w:r>
+        <w:rPr>
+          <w:rFonts w:ascii="Times New Roman" w:hAnsi="Times New Roman" w:cs="Times New Roman"/>
+          <w:sz w:val="28"/>
+          <w:szCs w:val="28"/>
+        </w:rPr>
+        <w:t>Последнее – клонируем 2 сетевых репозитория одногруппника</w:t>
+      </w:r>
+    </w:p>
+    <w:p>
+      <w:pPr>
+        <w:ind w:firstLine="709"/>
+        <w:rPr>
+          <w:rFonts w:ascii="Times New Roman" w:hAnsi="Times New Roman" w:cs="Times New Roman"/>
+          <w:sz w:val="28"/>
+          <w:szCs w:val="28"/>
+        </w:rPr>
+      </w:pPr>
+      <w:r>
+        <w:rPr>
+          <w:rFonts w:ascii="Times New Roman" w:hAnsi="Times New Roman" w:cs="Times New Roman"/>
+          <w:sz w:val="28"/>
+          <w:szCs w:val="28"/>
+        </w:rPr>
+        <w:drawing>
+          <wp:inline distT="0" distB="0" distL="0" distR="0" wp14:anchorId="4E2AE8A3" wp14:editId="4043CD9A">
+            <wp:extent cx="5940425" cy="2132330"/>
+            <wp:effectExtent l="0" t="0" r="3175" b="1270"/>
+            <wp:docPr id="9" name="Рисунок 9"/>
+            <wp:cNvGraphicFramePr>
+              <a:graphicFrameLocks xmlns:a="http://schemas.openxmlformats.org/drawingml/2006/main" noChangeAspect="1"/>
+            </wp:cNvGraphicFramePr>
+            <a:graphic xmlns:a="http://schemas.openxmlformats.org/drawingml/2006/main">
+              <a:graphicData uri="http://schemas.openxmlformats.org/drawingml/2006/picture">
+                <pic:pic xmlns:pic="http://schemas.openxmlformats.org/drawingml/2006/picture">
+                  <pic:nvPicPr>
+                    <pic:cNvPr id="1" name=""/>
+                    <pic:cNvPicPr/>
+                  </pic:nvPicPr>
+                  <pic:blipFill>
+                    <a:blip r:embed="rId15"/>
+                    <a:stretch>
+                      <a:fillRect/>
+                    </a:stretch>
+                  </pic:blipFill>
+                  <pic:spPr>
+                    <a:xfrm>
+                      <a:off x="0" y="0"/>
+                      <a:ext cx="5940425" cy="2132330"/>
+                    </a:xfrm>
+                    <a:prstGeom prst="rect">
+                      <a:avLst/>
+                    </a:prstGeom>
+                  </pic:spPr>
+                </pic:pic>
+              </a:graphicData>
+            </a:graphic>
+          </wp:inline>
+        </w:drawing>
+      </w:r>
+    </w:p>
+    <w:p>
+      <w:pPr>
+        <w:ind w:firstLine="709"/>
+        <w:rPr>
+          <w:rFonts w:ascii="Times New Roman" w:hAnsi="Times New Roman" w:cs="Times New Roman"/>
+          <w:sz w:val="28"/>
+          <w:szCs w:val="28"/>
+        </w:rPr>
+      </w:pPr>
+      <w:r>
+        <w:rPr>
+          <w:rFonts w:ascii="Times New Roman" w:hAnsi="Times New Roman" w:cs="Times New Roman"/>
+          <w:sz w:val="28"/>
+          <w:szCs w:val="28"/>
+        </w:rPr>
+        <w:drawing>
+          <wp:inline distT="0" distB="0" distL="0" distR="0" wp14:anchorId="456F67EB" wp14:editId="69A15390">
+            <wp:extent cx="5324475" cy="2017097"/>
+            <wp:effectExtent l="0" t="0" r="0" b="2540"/>
+            <wp:docPr id="10" name="Рисунок 10"/>
+            <wp:cNvGraphicFramePr>
+              <a:graphicFrameLocks xmlns:a="http://schemas.openxmlformats.org/drawingml/2006/main" noChangeAspect="1"/>
+            </wp:cNvGraphicFramePr>
+            <a:graphic xmlns:a="http://schemas.openxmlformats.org/drawingml/2006/main">
+              <a:graphicData uri="http://schemas.openxmlformats.org/drawingml/2006/picture">
+                <pic:pic xmlns:pic="http://schemas.openxmlformats.org/drawingml/2006/picture">
+                  <pic:nvPicPr>
+                    <pic:cNvPr id="1" name=""/>
+                    <pic:cNvPicPr/>
+                  </pic:nvPicPr>
+                  <pic:blipFill>
+                    <a:blip r:embed="rId16"/>
+                    <a:stretch>
+                      <a:fillRect/>
+                    </a:stretch>
+                  </pic:blipFill>
+                  <pic:spPr>
+                    <a:xfrm>
+                      <a:off x="0" y="0"/>
+                      <a:ext cx="5329684" cy="2019070"/>
+                    </a:xfrm>
+                    <a:prstGeom prst="rect">
+                      <a:avLst/>
+                    </a:prstGeom>
+                  </pic:spPr>
+                </pic:pic>
+              </a:graphicData>
+            </a:graphic>
+          </wp:inline>
+        </w:drawing>
+      </w:r>
+    </w:p>
+    <w:p>
+      <w:pPr>
+        <w:ind w:firstLine="709"/>
+        <w:rPr>
+          <w:rFonts w:ascii="Times New Roman" w:hAnsi="Times New Roman" w:cs="Times New Roman"/>
+          <w:sz w:val="28"/>
+          <w:szCs w:val="28"/>
+        </w:rPr>
+      </w:pPr>
+      <w:r>
+        <w:rPr>
+          <w:rFonts w:ascii="Times New Roman" w:hAnsi="Times New Roman" w:cs="Times New Roman"/>
+          <w:sz w:val="28"/>
+          <w:szCs w:val="28"/>
+        </w:rPr>
+        <w:drawing>
+          <wp:inline distT="0" distB="0" distL="0" distR="0" wp14:anchorId="653C614F" wp14:editId="2664648E">
+            <wp:extent cx="4352925" cy="2682016"/>
+            <wp:effectExtent l="0" t="0" r="0" b="4445"/>
+            <wp:docPr id="12" name="Рисунок 12"/>
+            <wp:cNvGraphicFramePr>
+              <a:graphicFrameLocks xmlns:a="http://schemas.openxmlformats.org/drawingml/2006/main" noChangeAspect="1"/>
+            </wp:cNvGraphicFramePr>
+            <a:graphic xmlns:a="http://schemas.openxmlformats.org/drawingml/2006/main">
+              <a:graphicData uri="http://schemas.openxmlformats.org/drawingml/2006/picture">
+                <pic:pic xmlns:pic="http://schemas.openxmlformats.org/drawingml/2006/picture">
+                  <pic:nvPicPr>
+                    <pic:cNvPr id="1" name=""/>
+                    <pic:cNvPicPr/>
+                  </pic:nvPicPr>
+                  <pic:blipFill>
+                    <a:blip r:embed="rId17"/>
+                    <a:stretch>
+                      <a:fillRect/>
+                    </a:stretch>
+                  </pic:blipFill>
+                  <pic:spPr>
+                    <a:xfrm>
+                      <a:off x="0" y="0"/>
+                      <a:ext cx="4358783" cy="2685626"/>
+                    </a:xfrm>
+                    <a:prstGeom prst="rect">
+                      <a:avLst/>
+                    </a:prstGeom>
+                  </pic:spPr>
+                </pic:pic>
+              </a:graphicData>
+            </a:graphic>
+          </wp:inline>
+        </w:drawing>
+      </w:r>
     </w:p>
     <w:sectPr>
-      <w:footerReference w:type="default" r:id="rId7"/>
+      <w:footerReference w:type="default" r:id="rId18"/>
       <w:pgSz w:w="11906" w:h="16838"/>
       <w:pgMar w:top="1134" w:right="850" w:bottom="1134" w:left="1701" w:header="708" w:footer="708" w:gutter="0"/>
       <w:cols w:space="708"/>

</xml_diff>